<commit_message>
Commit after fixing issue with README file.
</commit_message>
<xml_diff>
--- a/critical_files/The top 10 Lessons Learned during this FIM Project.docx
+++ b/critical_files/The top 10 Lessons Learned during this FIM Project.docx
@@ -188,7 +188,19 @@
         </w:numPr>
       </w:pPr>
       <w:r>
-        <w:t>Since every computational action incurs cost—whether collecting, storing, transmitting, or processing data—detection and logging rules were optimized accordingly. Only essential digital assets were monitored, and administrators were alerted to critical events.</w:t>
+        <w:t>Since every computational action incurs cost</w:t>
+      </w:r>
+      <w:r>
+        <w:t xml:space="preserve">, </w:t>
+      </w:r>
+      <w:r>
+        <w:t>whether collecting, storing, transmitting, or processing data</w:t>
+      </w:r>
+      <w:r>
+        <w:t xml:space="preserve">, </w:t>
+      </w:r>
+      <w:r>
+        <w:t>detection and logging rules were optimized accordingly. Only essential digital assets were monitored, and administrators were alerted to critical events.</w:t>
       </w:r>
     </w:p>
     <w:p>

</xml_diff>